<commit_message>
Sweep the injection probability and correct doc sections 3.3 3.4 and 4.2
</commit_message>
<xml_diff>
--- a/docx/胡宏彬-进度文档-20260819.docx
+++ b/docx/胡宏彬-进度文档-20260819.docx
@@ -8929,6 +8929,17 @@
           <w:rFonts w:hint="eastAsia"/>
         </w:rPr>
         <w:t xml:space="preserve">定理 3 是本文与算子立即生效的强化学习清洗方案的核心差异。在那类方案中，训练期间的每一次错误探索都在真实语料上留下痕迹，安全性只能在收敛后的期望意义上成立。本文的探索发生在副本上，未通过屏蔽的尝试不留下任何后果，学习过程因而不构成破坏过程。这一性质使智能体可以在真实语料上直接学习，不需要先在仿真环境中预训练。</w:t>
+      </w:r>
+    </w:p>
+    <w:p>
+      <w:pPr>
+        <w:ind w:firstLineChars="200" w:firstLine="420"/>
+      </w:pPr>
+      <w:r>
+        <w:rPr>
+          <w:rFonts w:hint="eastAsia"/>
+        </w:rPr>
+        <w:t xml:space="preserve">定理 3 的成立与候选的来源无关。证明只用到两点，动作作用于副本的拷贝，以及工作副本仅在三个条件同时成立时才被更新。候选由提议者生成还是由策略强制注入，都不改变这两点，因此对强制注入的候选，被提交编辑的结构失真同样受同一阈值约束。</w:t>
       </w:r>
     </w:p>
     <w:p>
@@ -10217,6 +10228,17 @@
         <w:rPr>
           <w:rFonts w:hint="eastAsia"/>
         </w:rPr>
+        <w:t xml:space="preserve">策略学习相对固定规则的增益分两类。一类发生在既有候选之内，策略依据画像簇与撤销原因调整备选次序，把更可能通过屏蔽的动作排到前面。另一类是主动尝试提议者从不给出的选项，这是固定规则无论如何调整都做不到的，因为它的候选集完全由缺陷判断决定，判断不指向某个算子，该算子就永远没有机会。第二类增益需要注入机制才能兑现，也是策略能够学习这件事的本质意义所在。</w:t>
+      </w:r>
+    </w:p>
+    <w:p>
+      <w:pPr>
+        <w:ind w:firstLineChars="200" w:firstLine="420"/>
+      </w:pPr>
+      <w:r>
+        <w:rPr>
+          <w:rFonts w:hint="eastAsia"/>
+        </w:rPr>
         <w:t xml:space="preserve">暖启动用固定规则策略的历史轨迹填充。每个格子的初值取该格子历史上实际获得的屏蔽奖励的均值，访问计数取历史样本数与上限的较小者。这样取值使暖启动同时编码了负面证据，被撤销的候选按探测代价计入负奖励，因此一个历来无一通过的格子初值低于零，而未被访问过的格子取乐观初值高于零，策略据此自然地优先尝试未访问格而回避已知无效格，不需要为回避已知无效格另设机制。若改用接受率乘平均效用增益，无一通过的格子会得到零，从未有效与从未尝试就分不开了。重分段一列不按簇分别填充，而是整列取其全局均值，依据是该算子的接受率在簇之间没有可检出的差异，按簇填充等于把抽样噪声写成先验。</w:t>
       </w:r>
     </w:p>
@@ -10228,7 +10250,7 @@
         <w:rPr>
           <w:rFonts w:hint="eastAsia"/>
         </w:rPr>
-        <w:t xml:space="preserve">乐观初始化与重分段一列的取值之间存在一个需要说清的交互。重分段整列取全局均值 0.6095，而历史从未访问过的格子取乐观初值 1.0，后者高于前者，因此上置信界在学习早期会先去访问空格，重分段要到空格被填得差不多之后才可能被选中。这是乐观初始化按设计驱动探索的结果，配合阶段零已经证明重分段没有簇级结构，早期不访问它并不会损失可学的信息，也不构成实现缺陷。</w:t>
+        <w:t xml:space="preserve">乐观初始化的作用范围有一个边界，实测把它暴露了出来。上置信界只在提议者给出的候选集内选择，乐观初值再高也无法选中没有被提出的动作。首次在两千窗口上运行学习循环时，簇 1 与簇 11 上的去噪访问次数为零，两簇合计 392 个窗口占语料百分之十九点六，原因是提议者的候选集由主导缺陷决定，而这些窗口的主导缺陷从不是噪声。乐观初始化作用在选择层，这里的盲区却在提议层，层次不对应，因而无效。本文为此引入强制候选注入，当某个画像簇与算子的组合没有任何观测时，以概率 p_inject 把该算子直接加入候选集，注入的候选照常经过沙箱与完整屏蔽。注入的候选取该算子最保守的参数，因为它探的是一个尚无信息的格子，不宜同时带上激进的设定。重分段一列的情形与此不同，它整列取全局均值 0.6095，低于空格的乐观初值 1.0，因此学习早期不会被选中。这是乐观初始化按设计驱动探索的结果，配合阶段零已经证明该算子没有簇级结构，早期不访问它不会损失可学的信息。</w:t>
       </w:r>
     </w:p>
     <w:p>
@@ -10832,6 +10854,17 @@
       </w:r>
     </w:p>
     <w:p>
+      <w:pPr>
+        <w:ind w:firstLineChars="200" w:firstLine="420"/>
+      </w:pPr>
+      <w:r>
+        <w:rPr>
+          <w:rFonts w:hint="eastAsia"/>
+        </w:rPr>
+        <w:t xml:space="preserve">后验接近确定这一条需要用相对的方式表达。缺陷类型后验分布在五个假设之上，实测其最大值即使在被判为干净的窗口上也只到 0.554，按绝对阈值设在接近确定的位置将永远不会触发。区分已定与未定的是干净假设领先次高假设的幅度，因此判据取干净为最高后验且领先次高至少 1.5 倍。该判据在运行之前定死。这是唯一一处窗口可以不经屏蔽就被略过的地方，所以它要求的是一个领先幅度而不只是一个最大值。</w:t>
+      </w:r>
+    </w:p>
+    <w:p>
       <w:pPr/>
     </w:p>
     <w:tbl>
@@ -14385,7 +14418,7 @@
         <w:rPr>
           <w:rFonts w:hint="eastAsia"/>
         </w:rPr>
-        <w:t>这一组检验按价值分配探测预算是否优于均匀分配。固定语料总预算，比较均匀分配、按风险分数分配与本文按价值估计分配三种方式。曲线的横轴取计算开销，这样打分族可以一并参与，因为 Data Shapley 需要反复重训、TimeInf 需要海森向量积、本文的探测只做前向，三者的单位开销不同，按探测次数比较对打分族没有意义。按探测次数的版本另行给出，用于本文方法内部三种分配方式的对比。同时统计被跳过窗口的构成，核对跳过的是否确实是后验确定且指向干净的窗口。</w:t>
+        <w:t xml:space="preserve">这一组检验按价值分配探测预算是否优于均匀分配。固定语料总预算，比较均匀分配、按风险分数分配与本文按价值估计分配三种方式。曲线的横轴取计算开销，这样打分族可以一并参与，因为 Data Shapley 需要反复重训、TimeInf 需要海森向量积、本文的探测只做前向，三者的单位开销不同，按探测次数比较对打分族没有意义。按探测次数的版本另行给出，用于本文方法内部三种分配方式的对比。收益与代价必须同表呈现。八百个训练窗口上跳过 124 个，省下 663 次探测，而被跳过的窗口中有 24 个含真实污染，漏检率为百分之十九点四，按缺陷类型为重复片段 9 个、噪声 9 个、尖峰 6 个。只报节省不报漏检会让这一机制显得没有代价。</w:t>
       </w:r>
     </w:p>
     <w:p>

</xml_diff>